<commit_message>
Cas DURANCEL : réponses réduites aux calculs
Co-Authored-By: Claude Opus 5.5 <noreply@anthropic.com>
Claude-Session: https://claude.ai/code/session_01QEYQGJWiqJDfMnwpNecvDB
</commit_message>
<xml_diff>
--- a/MBA2_Volet_financier_du_BP_S5_Cas_DURANCEL_Enonce.docx
+++ b/MBA2_Volet_financier_du_BP_S5_Cas_DURANCEL_Enonce.docx
@@ -8445,46 +8445,12 @@
           <w:bCs/>
           <w:color w:val="E8571E"/>
         </w:rPr>
-        <w:t>Corrigé – Réponses aux questions</w:t>
+        <w:t>Réponses</w:t>
       </w:r>
     </w:p>
     <w:p>
       <w:pPr>
-        <w:spacing w:after="100"/>
-        <w:jc w:val="both"/>
-      </w:pPr>
-      <w:r>
-        <w:rPr>
-          <w:b/>
-          <w:bCs/>
-        </w:rPr>
-        <w:t xml:space="preserve">Hypothèses retenues : </w:t>
-      </w:r>
-      <w:r>
-        <w:rPr/>
-        <w:t xml:space="preserve">raisonnement en flux différentiels (ce que le projet ajoute ou retire à l’entreprise) ; flux de fin d’année ; année N = date 0. Le BFR d’une année est constitué fin de l’année précédente (BFR de N+1 = 45/360 × 1 800 = 225 k€ décaissé en N). Les frais de démarrage (80 k€) sont des charges déductibles de N : décaissement net d’impôt = 80 × (1 − 25 %) = 60 k€. L’entreprise étant bénéficiaire, toute moins-value génère une économie d’impôt immédiate.</w:t>
-      </w:r>
-    </w:p>
-    <w:p>
-      <w:pPr>
-        <w:spacing w:after="100"/>
-        <w:jc w:val="both"/>
-      </w:pPr>
-      <w:r>
-        <w:rPr>
-          <w:b/>
-          <w:bCs/>
-        </w:rPr>
-        <w:t xml:space="preserve">Amortissements : </w:t>
-      </w:r>
-      <w:r>
-        <w:rPr/>
-        <w:t xml:space="preserve">bâtiment 900/15 = 60 k€/an ; ligne 2 500/5 = 500 k€/an ; robot 600/3 = 200 k€/an de N+3 à N+5. Total : 560 k€ en N+1 et N+2, 760 k€ de N+3 à N+5. VNC fin N+5 : bâtiment 900 − 5 × 60 = 600 k€ ; ligne 0 ; robot 0.</w:t>
-      </w:r>
-    </w:p>
-    <w:p>
-      <w:pPr>
-        <w:spacing w:after="60"/>
+        <w:spacing w:after="40"/>
         <w:jc w:val="both"/>
       </w:pPr>
       <w:r>
@@ -8493,163 +8459,96 @@
           <w:bCs/>
           <w:color w:val="E8571E"/>
         </w:rPr>
-        <w:t xml:space="preserve">1. Flux de trésorerie nets annuels (Annexes 1 à 4)</w:t>
+        <w:t xml:space="preserve">1. Flux de trésorerie nets (k€)</w:t>
       </w:r>
     </w:p>
     <w:p>
       <w:pPr>
-        <w:spacing w:after="100"/>
+        <w:spacing w:after="40"/>
         <w:jc w:val="both"/>
       </w:pPr>
       <w:r>
         <w:rPr/>
-        <w:t xml:space="preserve">FCF = CAF d’exploitation − investissements + cessions nettes d’impôt − variation du BFR.</w:t>
-      </w:r>
-    </w:p>
-    <w:p>
-      <w:pPr>
-        <w:spacing w:after="60"/>
-        <w:ind w:left="360"/>
-        <w:jc w:val="both"/>
-      </w:pPr>
+        <w:t xml:space="preserve">N : −60 − 3 400 + 100 − 225 = </w:t>
+      </w:r>
       <w:r>
         <w:rPr>
           <w:b/>
           <w:bCs/>
         </w:rPr>
-        <w:t xml:space="preserve">N : </w:t>
-      </w:r>
+        <w:t xml:space="preserve">−3 585</w:t>
+      </w:r>
+    </w:p>
+    <w:p>
+      <w:pPr>
+        <w:spacing w:after="40"/>
+        <w:jc w:val="both"/>
+      </w:pPr>
       <w:r>
         <w:rPr/>
-        <w:t xml:space="preserve">−60 (frais de démarrage nets) − 3 400 (bâtiment + ligne) + 100 (cession nette ancien matériel : 120 − 20 d’IS sur PV de 80) − 225 (BFR) = </w:t>
+        <w:t xml:space="preserve">N+1 : 665 − 100 = </w:t>
       </w:r>
       <w:r>
         <w:rPr>
           <w:b/>
           <w:bCs/>
         </w:rPr>
-        <w:t xml:space="preserve">−3 585 k€</w:t>
-      </w:r>
-    </w:p>
-    <w:p>
-      <w:pPr>
-        <w:spacing w:after="60"/>
-        <w:ind w:left="360"/>
-        <w:jc w:val="both"/>
-      </w:pPr>
+        <w:t xml:space="preserve">565</w:t>
+      </w:r>
+      <w:r>
+        <w:rPr/>
+        <w:t xml:space="preserve">   N+2 : 965 − 600 − 100 = </w:t>
+      </w:r>
       <w:r>
         <w:rPr>
           <w:b/>
           <w:bCs/>
         </w:rPr>
-        <w:t xml:space="preserve">N+1 : </w:t>
+        <w:t xml:space="preserve">265</w:t>
       </w:r>
       <w:r>
         <w:rPr/>
-        <w:t xml:space="preserve">665 − 100 = </w:t>
+        <w:t xml:space="preserve">   N+3 : 1 405 − 30 = </w:t>
       </w:r>
       <w:r>
         <w:rPr>
           <w:b/>
           <w:bCs/>
         </w:rPr>
-        <w:t xml:space="preserve">565 k€</w:t>
-      </w:r>
+        <w:t xml:space="preserve">1 375</w:t>
+      </w:r>
+    </w:p>
+    <w:p>
+      <w:pPr>
+        <w:spacing w:after="40"/>
+        <w:jc w:val="both"/>
+      </w:pPr>
       <w:r>
         <w:rPr/>
-        <w:t xml:space="preserve"> ; </w:t>
+        <w:t xml:space="preserve">N+4 : 1 504 + 80 = </w:t>
       </w:r>
       <w:r>
         <w:rPr>
           <w:b/>
           <w:bCs/>
         </w:rPr>
-        <w:t xml:space="preserve">N+2 : </w:t>
+        <w:t xml:space="preserve">1 584</w:t>
       </w:r>
       <w:r>
         <w:rPr/>
-        <w:t xml:space="preserve">965 − 600 (robot) − 100 = </w:t>
+        <w:t xml:space="preserve">   N+5 : 1 240 + 375 + 225 + 525 = </w:t>
       </w:r>
       <w:r>
         <w:rPr>
           <w:b/>
           <w:bCs/>
         </w:rPr>
-        <w:t xml:space="preserve">265 k€</w:t>
-      </w:r>
-      <w:r>
-        <w:rPr/>
-        <w:t xml:space="preserve"> ; </w:t>
-      </w:r>
-      <w:r>
-        <w:rPr>
-          <w:b/>
-          <w:bCs/>
-        </w:rPr>
-        <w:t xml:space="preserve">N+3 : </w:t>
-      </w:r>
-      <w:r>
-        <w:rPr/>
-        <w:t xml:space="preserve">1 405 − 30 = </w:t>
-      </w:r>
-      <w:r>
-        <w:rPr>
-          <w:b/>
-          <w:bCs/>
-        </w:rPr>
-        <w:t xml:space="preserve">1 375 k€</w:t>
-      </w:r>
-      <w:r>
-        <w:rPr/>
-        <w:t xml:space="preserve"> ; </w:t>
-      </w:r>
-      <w:r>
-        <w:rPr>
-          <w:b/>
-          <w:bCs/>
-        </w:rPr>
-        <w:t xml:space="preserve">N+4 : </w:t>
-      </w:r>
-      <w:r>
-        <w:rPr/>
-        <w:t xml:space="preserve">1 504 + 80 = </w:t>
-      </w:r>
-      <w:r>
-        <w:rPr>
-          <w:b/>
-          <w:bCs/>
-        </w:rPr>
-        <w:t xml:space="preserve">1 584 k€</w:t>
+        <w:t xml:space="preserve">2 365</w:t>
       </w:r>
     </w:p>
     <w:p>
       <w:pPr>
-        <w:spacing w:after="120"/>
-        <w:ind w:left="360"/>
-        <w:jc w:val="both"/>
-      </w:pPr>
-      <w:r>
-        <w:rPr>
-          <w:b/>
-          <w:bCs/>
-        </w:rPr>
-        <w:t xml:space="preserve">N+5 : </w:t>
-      </w:r>
-      <w:r>
-        <w:rPr/>
-        <w:t xml:space="preserve">1 240 (CAF) + 375 (récupération BFR) + 225 (ligne : 300 − 75 d’IS) + 525 (bâtiment : 500 + 25 d’économie d’IS sur MV de 100) = </w:t>
-      </w:r>
-      <w:r>
-        <w:rPr>
-          <w:b/>
-          <w:bCs/>
-        </w:rPr>
-        <w:t xml:space="preserve">2 365 k€</w:t>
-      </w:r>
-    </w:p>
-    <w:p>
-      <w:pPr>
-        <w:spacing w:after="60"/>
+        <w:spacing w:after="40"/>
         <w:jc w:val="both"/>
       </w:pPr>
       <w:r>
@@ -8658,12 +8557,12 @@
           <w:bCs/>
           <w:color w:val="E8571E"/>
         </w:rPr>
-        <w:t xml:space="preserve">2. VAN à 12 %</w:t>
+        <w:t xml:space="preserve">2. VAN</w:t>
       </w:r>
     </w:p>
     <w:p>
       <w:pPr>
-        <w:spacing w:after="100"/>
+        <w:spacing w:after="40"/>
         <w:jc w:val="both"/>
       </w:pPr>
       <w:r>
@@ -8675,33 +8574,12 @@
           <w:b/>
           <w:bCs/>
         </w:rPr>
-        <w:t xml:space="preserve">+458,0 k€</w:t>
-      </w:r>
-      <w:r>
-        <w:rPr/>
-        <w:t xml:space="preserve">.</w:t>
+        <w:t xml:space="preserve">458,0 k€</w:t>
       </w:r>
     </w:p>
     <w:p>
       <w:pPr>
-        <w:spacing w:after="120"/>
-        <w:jc w:val="both"/>
-      </w:pPr>
-      <w:r>
-        <w:rPr/>
-        <w:t xml:space="preserve">La VAN est positive : le projet rémunère les capitaux au-delà des 12 % exigés et crée environ 458 k€ de valeur. </w:t>
-      </w:r>
-      <w:r>
-        <w:rPr>
-          <w:b/>
-          <w:bCs/>
-        </w:rPr>
-        <w:t xml:space="preserve">Le projet est rentable.</w:t>
-      </w:r>
-    </w:p>
-    <w:p>
-      <w:pPr>
-        <w:spacing w:after="60"/>
+        <w:spacing w:after="40"/>
         <w:jc w:val="both"/>
       </w:pPr>
       <w:r>
@@ -8715,12 +8593,12 @@
     </w:p>
     <w:p>
       <w:pPr>
-        <w:spacing w:after="100"/>
+        <w:spacing w:after="40"/>
         <w:jc w:val="both"/>
       </w:pPr>
       <w:r>
         <w:rPr/>
-        <w:t xml:space="preserve">Par interpolation : VAN(15 %) = +92,2 k€ ; VAN(16 %) = −19,3 k€ → TRI = 15 % + 1 % × 92,2/(92,2 + 19,3) ≈ </w:t>
+        <w:t xml:space="preserve">VAN(15 %) = 92,2 ; VAN(16 %) = −19,3 → TRI = 15 % + 1 % × 92,2/111,5 = </w:t>
       </w:r>
       <w:r>
         <w:rPr>
@@ -8729,24 +8607,10 @@
         </w:rPr>
         <w:t xml:space="preserve">15,8 %</w:t>
       </w:r>
-      <w:r>
-        <w:rPr/>
-        <w:t xml:space="preserve"> (valeur exacte 15,82 %).</w:t>
-      </w:r>
     </w:p>
     <w:p>
       <w:pPr>
-        <w:spacing w:after="120"/>
-        <w:jc w:val="both"/>
-      </w:pPr>
-      <w:r>
-        <w:rPr/>
-        <w:t xml:space="preserve">TRI (15,8 %) &gt; coût du capital (12 %) : le projet est acceptable ; la marge de sécurité sur le taux est d’environ 3,8 points.</w:t>
-      </w:r>
-    </w:p>
-    <w:p>
-      <w:pPr>
-        <w:spacing w:after="60"/>
+        <w:spacing w:after="40"/>
         <w:jc w:val="both"/>
       </w:pPr>
       <w:r>
@@ -8755,17 +8619,17 @@
           <w:bCs/>
           <w:color w:val="E8571E"/>
         </w:rPr>
-        <w:t xml:space="preserve">4. Indice de profitabilité</w:t>
+        <w:t xml:space="preserve">4. IP</w:t>
       </w:r>
     </w:p>
     <w:p>
       <w:pPr>
-        <w:spacing w:after="120"/>
+        <w:spacing w:after="40"/>
         <w:jc w:val="both"/>
       </w:pPr>
       <w:r>
         <w:rPr/>
-        <w:t xml:space="preserve">IP = 1 + VAN/I₀ = 1 + 458,0/3 585 = </w:t>
+        <w:t xml:space="preserve">IP = 1 + 458,0/3 585 = </w:t>
       </w:r>
       <w:r>
         <w:rPr>
@@ -8774,25 +8638,10 @@
         </w:rPr>
         <w:t xml:space="preserve">1,128</w:t>
       </w:r>
-      <w:r>
-        <w:rPr/>
-        <w:t xml:space="preserve">. Chaque euro investi en N génère 1,128 € de flux actualisés, soit 0,128 € de création de valeur. IP &gt; 1 : projet rentable. </w:t>
-      </w:r>
-      <w:r>
-        <w:rPr>
-          <w:i/>
-          <w:iCs/>
-        </w:rPr>
-        <w:t xml:space="preserve">Remarque : </w:t>
-      </w:r>
-      <w:r>
-        <w:rPr/>
-        <w:t xml:space="preserve">si l’on intègre aussi le robot actualisé dans le capital investi (3 585 + 600/1,12² = 4 063 k€), IP ≈ 1,113 – la conclusion est inchangée.</w:t>
-      </w:r>
     </w:p>
     <w:p>
       <w:pPr>
-        <w:spacing w:after="60"/>
+        <w:spacing w:after="40"/>
         <w:jc w:val="both"/>
       </w:pPr>
       <w:r>
@@ -8801,43 +8650,29 @@
           <w:bCs/>
           <w:color w:val="E8571E"/>
         </w:rPr>
-        <w:t xml:space="preserve">5. DRCI (Annexe 5)</w:t>
+        <w:t xml:space="preserve">5. DRCI</w:t>
       </w:r>
     </w:p>
     <w:p>
       <w:pPr>
-        <w:spacing w:after="100"/>
+        <w:spacing w:after="40"/>
         <w:jc w:val="both"/>
       </w:pPr>
       <w:r>
         <w:rPr/>
-        <w:t xml:space="preserve">Le cumul des FCF actualisés est de −883,9 k€ fin N+4 et devient positif (+458,0 k€) fin N+5. Par interpolation linéaire : DRCI = 4 + 883,9/1 342,0 = </w:t>
+        <w:t xml:space="preserve">DRCI = 4 + 883,9/1 342,0 = 4,66 ans = </w:t>
       </w:r>
       <w:r>
         <w:rPr>
           <w:b/>
           <w:bCs/>
         </w:rPr>
-        <w:t xml:space="preserve">4,66 ans, soit environ 4 ans et 8 mois</w:t>
-      </w:r>
-      <w:r>
-        <w:rPr/>
-        <w:t xml:space="preserve">.</w:t>
+        <w:t xml:space="preserve">4 ans 8 mois</w:t>
       </w:r>
     </w:p>
     <w:p>
       <w:pPr>
-        <w:spacing w:after="120"/>
-        <w:jc w:val="both"/>
-      </w:pPr>
-      <w:r>
-        <w:rPr/>
-        <w:t xml:space="preserve">Le capital est récupéré, mais très tard, à moins d’un an et demi de la fin de l’horizon de 5 ans : le projet est rentable mais peu liquide et donc plus risqué.</w:t>
-      </w:r>
-    </w:p>
-    <w:p>
-      <w:pPr>
-        <w:spacing w:after="60"/>
+        <w:spacing w:after="40"/>
         <w:jc w:val="both"/>
       </w:pPr>
       <w:r>
@@ -8846,17 +8681,27 @@
           <w:bCs/>
           <w:color w:val="E8571E"/>
         </w:rPr>
-        <w:t xml:space="preserve">6. DRCI sans valeurs de cession ni récupération du BFR</w:t>
+        <w:t xml:space="preserve">6. DRCI sans cessions ni récupération du BFR</w:t>
       </w:r>
     </w:p>
     <w:p>
       <w:pPr>
-        <w:spacing w:after="100"/>
+        <w:spacing w:after="40"/>
         <w:jc w:val="both"/>
       </w:pPr>
       <w:r>
         <w:rPr/>
-        <w:t xml:space="preserve">On retire de N+5 la récupération du BFR (375) et les cessions nettes (225 + 525) : FCF N+5 = 1 240 k€, soit 1 240 × 0,5674 = 703,6 k€ actualisés. Cumul fin N+5 = −883,9 + 703,6 = </w:t>
+        <w:t xml:space="preserve">FCF N+5 = 1 240 → actualisé : 1 240 × 0,5674 = 703,6</w:t>
+      </w:r>
+    </w:p>
+    <w:p>
+      <w:pPr>
+        <w:spacing w:after="40"/>
+        <w:jc w:val="both"/>
+      </w:pPr>
+      <w:r>
+        <w:rPr/>
+        <w:t xml:space="preserve">Cumul fin N+5 = −883,9 + 703,6 = </w:t>
       </w:r>
       <w:r>
         <w:rPr>
@@ -8867,29 +8712,23 @@
       </w:r>
       <w:r>
         <w:rPr/>
-        <w:t xml:space="preserve">.</w:t>
-      </w:r>
-    </w:p>
-    <w:p>
-      <w:pPr>
-        <w:spacing w:after="100"/>
-        <w:jc w:val="both"/>
-      </w:pPr>
+        <w:t xml:space="preserve"> → </w:t>
+      </w:r>
       <w:r>
         <w:rPr>
           <w:b/>
           <w:bCs/>
         </w:rPr>
-        <w:t xml:space="preserve">Le capital investi n’est jamais récupéré sur l’horizon de 5 ans</w:t>
+        <w:t xml:space="preserve">DRCI &gt; 5 ans</w:t>
       </w:r>
       <w:r>
         <w:rPr/>
-        <w:t xml:space="preserve"> (DRCI &gt; 5 ans) et la VAN deviendrait négative (−180 k€).</w:t>
+        <w:t xml:space="preserve"> (capital non récupéré).</w:t>
       </w:r>
     </w:p>
     <w:p>
       <w:pPr>
-        <w:spacing w:after="120"/>
+        <w:spacing w:after="40"/>
         <w:jc w:val="both"/>
       </w:pPr>
       <w:r>
@@ -8901,12 +8740,12 @@
       </w:r>
       <w:r>
         <w:rPr/>
-        <w:t xml:space="preserve">la rentabilité du projet repose sur les flux de fin de projet (≈ 638 k€ actualisés, soit plus que la VAN de 458 k€). Ces flux sont incertains (valeur de marché du bâtiment, prix de revente de la ligne) : il faut fiabiliser ces estimations et mener une analyse de sensibilité. Ce DRCI recalculé montre que l’exploitation seule ne suffit pas, sur 5 ans, à rembourser l’investissement ; un horizon plus long (le bâtiment est amortissable sur 15 ans) serait aussi plus représentatif.</w:t>
+        <w:t xml:space="preserve">la rentabilité du projet dépend des flux de fin de projet (valeurs de cession + BFR).</w:t>
       </w:r>
     </w:p>
     <w:p>
       <w:pPr>
-        <w:spacing w:after="60"/>
+        <w:spacing w:after="40"/>
         <w:jc w:val="both"/>
       </w:pPr>
       <w:r>
@@ -8915,27 +8754,27 @@
           <w:bCs/>
           <w:color w:val="E8571E"/>
         </w:rPr>
-        <w:t xml:space="preserve">7. VAN en omettant l’effet de cannibalisation</w:t>
+        <w:t xml:space="preserve">7. VAN sans cannibalisation</w:t>
       </w:r>
     </w:p>
     <w:p>
       <w:pPr>
-        <w:spacing w:after="100"/>
+        <w:spacing w:after="40"/>
         <w:jc w:val="both"/>
       </w:pPr>
       <w:r>
         <w:rPr/>
-        <w:t xml:space="preserve">La perte de marge de 50 k€/an coûte, après impôt, 50 × (1 − 25 %) = 37,5 k€/an de N+1 à N+5. Valeur actuelle : 37,5 × [1 − 1,12⁻⁵]/0,12 = 37,5 × 3,6048 = 135,2 k€.</w:t>
+        <w:t xml:space="preserve">Effet après impôt : 50 × 0,75 = 37,5/an → 37,5 × 3,6048 = 135,2</w:t>
       </w:r>
     </w:p>
     <w:p>
       <w:pPr>
-        <w:spacing w:after="100"/>
+        <w:spacing w:after="40"/>
         <w:jc w:val="both"/>
       </w:pPr>
       <w:r>
         <w:rPr/>
-        <w:t xml:space="preserve">VAN sans cannibalisation = 458,0 + 135,2 = </w:t>
+        <w:t xml:space="preserve">VAN = 458,0 + 135,2 = </w:t>
       </w:r>
       <w:r>
         <w:rPr>
@@ -8946,12 +8785,12 @@
       </w:r>
       <w:r>
         <w:rPr/>
-        <w:t xml:space="preserve"> (surévaluation d’environ 30 %).</w:t>
+        <w:t xml:space="preserve"> (+30 %)</w:t>
       </w:r>
     </w:p>
     <w:p>
       <w:pPr>
-        <w:spacing w:after="120"/>
+        <w:spacing w:after="40"/>
         <w:jc w:val="both"/>
       </w:pPr>
       <w:r>
@@ -8963,24 +8802,7 @@
       </w:r>
       <w:r>
         <w:rPr/>
-        <w:t xml:space="preserve">omettre la cannibalisation viole le principe des flux différentiels : seuls comptent les flux supplémentaires générés par le projet pour l’ensemble de l’entreprise, y compris les marges perdues sur les produits existants. L’oubli conduirait à surestimer la création de valeur (et le TRI). Ici la décision d’investir reste la même (VAN &gt; 0 dans les deux cas), mais sur un projet plus marginal l’erreur pourrait faire accepter un projet destructeur de valeur.</w:t>
-      </w:r>
-    </w:p>
-    <w:p>
-      <w:pPr>
-        <w:spacing w:after="200"/>
-        <w:jc w:val="both"/>
-      </w:pPr>
-      <w:r>
-        <w:rPr>
-          <w:b/>
-          <w:bCs/>
-        </w:rPr>
-        <w:t xml:space="preserve">Synthèse : </w:t>
-      </w:r>
-      <w:r>
-        <w:rPr/>
-        <w:t xml:space="preserve">VAN = +458 k€ ; TRI ≈ 15,8 % &gt; 12 % ; IP ≈ 1,13 ; DRCI ≈ 4 ans 8 mois. Le projet est rentable et peut être retenu, sous réserve de la fiabilité des valeurs de cession finales dont dépend une grande partie de sa rentabilité.</w:t>
+        <w:t xml:space="preserve">VAN surestimée ; la cannibalisation est un flux différentiel à intégrer.</w:t>
       </w:r>
     </w:p>
     <w:p>

</xml_diff>

<commit_message>
Cas DURANCEL : tableaux remplis, partie réponses retirée, annexe 5 partielle
Co-Authored-By: Claude Opus 5.5 <noreply@anthropic.com>
Claude-Session: https://claude.ai/code/session_01QEYQGJWiqJDfMnwpNecvDB
</commit_message>
<xml_diff>
--- a/MBA2_Volet_financier_du_BP_S5_Cas_DURANCEL_Enonce.docx
+++ b/MBA2_Volet_financier_du_BP_S5_Cas_DURANCEL_Enonce.docx
@@ -8159,44 +8159,30 @@
           </w:tcPr>
           <w:p>
             <w:pPr>
-              <w:jc w:val="right"/>
-            </w:pPr>
-            <w:r>
-              <w:rPr>
-                <w:sz w:val="20"/>
-                <w:szCs w:val="20"/>
-              </w:rPr>
-              <w:t xml:space="preserve">1 006,7</w:t>
-            </w:r>
-          </w:p>
-        </w:tc>
-        <w:tc>
-          <w:tcPr>
-            <w:tcW w:w="1233" w:type="dxa"/>
-            <w:tcBorders>
-              <w:top w:val="single" w:sz="4" w:space="0" w:color="E8571E"/>
-              <w:left w:val="single" w:sz="4" w:space="0" w:color="E8571E"/>
-              <w:bottom w:val="single" w:sz="4" w:space="0" w:color="E8571E"/>
-              <w:right w:val="single" w:sz="4" w:space="0" w:color="E8571E"/>
-            </w:tcBorders>
-            <w:tcMar>
-              <w:top w:w="60" w:type="dxa"/>
-              <w:left w:w="80" w:type="dxa"/>
-              <w:bottom w:w="60" w:type="dxa"/>
-              <w:right w:w="80" w:type="dxa"/>
-            </w:tcMar>
-          </w:tcPr>
-          <w:p>
-            <w:pPr>
-              <w:jc w:val="right"/>
-            </w:pPr>
-            <w:r>
-              <w:rPr>
-                <w:sz w:val="20"/>
-                <w:szCs w:val="20"/>
-              </w:rPr>
-              <w:t xml:space="preserve">1 342,0</w:t>
-            </w:r>
+              <w:jc w:val="center"/>
+            </w:pPr>
+          </w:p>
+        </w:tc>
+        <w:tc>
+          <w:tcPr>
+            <w:tcW w:w="1233" w:type="dxa"/>
+            <w:tcBorders>
+              <w:top w:val="single" w:sz="4" w:space="0" w:color="E8571E"/>
+              <w:left w:val="single" w:sz="4" w:space="0" w:color="E8571E"/>
+              <w:bottom w:val="single" w:sz="4" w:space="0" w:color="E8571E"/>
+              <w:right w:val="single" w:sz="4" w:space="0" w:color="E8571E"/>
+            </w:tcBorders>
+            <w:tcMar>
+              <w:top w:w="60" w:type="dxa"/>
+              <w:left w:w="80" w:type="dxa"/>
+              <w:bottom w:w="60" w:type="dxa"/>
+              <w:right w:w="80" w:type="dxa"/>
+            </w:tcMar>
+          </w:tcPr>
+          <w:p>
+            <w:pPr>
+              <w:jc w:val="center"/>
+            </w:pPr>
           </w:p>
         </w:tc>
       </w:tr>
@@ -8351,460 +8337,58 @@
           </w:tcPr>
           <w:p>
             <w:pPr>
-              <w:jc w:val="right"/>
-            </w:pPr>
-            <w:r>
-              <w:rPr>
-                <w:b/>
-                <w:bCs/>
-                <w:sz w:val="20"/>
-                <w:szCs w:val="20"/>
-              </w:rPr>
-              <w:t xml:space="preserve">−1 890,6</w:t>
-            </w:r>
-          </w:p>
-        </w:tc>
-        <w:tc>
-          <w:tcPr>
-            <w:tcW w:w="1233" w:type="dxa"/>
-            <w:tcBorders>
-              <w:top w:val="single" w:sz="4" w:space="0" w:color="E8571E"/>
-              <w:left w:val="single" w:sz="4" w:space="0" w:color="E8571E"/>
-              <w:bottom w:val="single" w:sz="4" w:space="0" w:color="E8571E"/>
-              <w:right w:val="single" w:sz="4" w:space="0" w:color="E8571E"/>
-            </w:tcBorders>
-            <w:shd w:val="clear" w:color="auto" w:fill="F9DDD5"/>
-            <w:tcMar>
-              <w:top w:w="60" w:type="dxa"/>
-              <w:left w:w="80" w:type="dxa"/>
-              <w:bottom w:w="60" w:type="dxa"/>
-              <w:right w:w="80" w:type="dxa"/>
-            </w:tcMar>
-          </w:tcPr>
-          <w:p>
-            <w:pPr>
-              <w:jc w:val="right"/>
-            </w:pPr>
-            <w:r>
-              <w:rPr>
-                <w:b/>
-                <w:bCs/>
-                <w:sz w:val="20"/>
-                <w:szCs w:val="20"/>
-              </w:rPr>
-              <w:t xml:space="preserve">−883,9</w:t>
-            </w:r>
-          </w:p>
-        </w:tc>
-        <w:tc>
-          <w:tcPr>
-            <w:tcW w:w="1233" w:type="dxa"/>
-            <w:tcBorders>
-              <w:top w:val="single" w:sz="4" w:space="0" w:color="E8571E"/>
-              <w:left w:val="single" w:sz="4" w:space="0" w:color="E8571E"/>
-              <w:bottom w:val="single" w:sz="4" w:space="0" w:color="E8571E"/>
-              <w:right w:val="single" w:sz="4" w:space="0" w:color="E8571E"/>
-            </w:tcBorders>
-            <w:shd w:val="clear" w:color="auto" w:fill="F9DDD5"/>
-            <w:tcMar>
-              <w:top w:w="60" w:type="dxa"/>
-              <w:left w:w="80" w:type="dxa"/>
-              <w:bottom w:w="60" w:type="dxa"/>
-              <w:right w:w="80" w:type="dxa"/>
-            </w:tcMar>
-          </w:tcPr>
-          <w:p>
-            <w:pPr>
-              <w:jc w:val="right"/>
-            </w:pPr>
-            <w:r>
-              <w:rPr>
-                <w:b/>
-                <w:bCs/>
-                <w:sz w:val="20"/>
-                <w:szCs w:val="20"/>
-              </w:rPr>
-              <w:t xml:space="preserve">458,0</w:t>
-            </w:r>
+              <w:jc w:val="center"/>
+            </w:pPr>
+          </w:p>
+        </w:tc>
+        <w:tc>
+          <w:tcPr>
+            <w:tcW w:w="1233" w:type="dxa"/>
+            <w:tcBorders>
+              <w:top w:val="single" w:sz="4" w:space="0" w:color="E8571E"/>
+              <w:left w:val="single" w:sz="4" w:space="0" w:color="E8571E"/>
+              <w:bottom w:val="single" w:sz="4" w:space="0" w:color="E8571E"/>
+              <w:right w:val="single" w:sz="4" w:space="0" w:color="E8571E"/>
+            </w:tcBorders>
+            <w:shd w:val="clear" w:color="auto" w:fill="F9DDD5"/>
+            <w:tcMar>
+              <w:top w:w="60" w:type="dxa"/>
+              <w:left w:w="80" w:type="dxa"/>
+              <w:bottom w:w="60" w:type="dxa"/>
+              <w:right w:w="80" w:type="dxa"/>
+            </w:tcMar>
+          </w:tcPr>
+          <w:p>
+            <w:pPr>
+              <w:jc w:val="center"/>
+            </w:pPr>
+          </w:p>
+        </w:tc>
+        <w:tc>
+          <w:tcPr>
+            <w:tcW w:w="1233" w:type="dxa"/>
+            <w:tcBorders>
+              <w:top w:val="single" w:sz="4" w:space="0" w:color="E8571E"/>
+              <w:left w:val="single" w:sz="4" w:space="0" w:color="E8571E"/>
+              <w:bottom w:val="single" w:sz="4" w:space="0" w:color="E8571E"/>
+              <w:right w:val="single" w:sz="4" w:space="0" w:color="E8571E"/>
+            </w:tcBorders>
+            <w:shd w:val="clear" w:color="auto" w:fill="F9DDD5"/>
+            <w:tcMar>
+              <w:top w:w="60" w:type="dxa"/>
+              <w:left w:w="80" w:type="dxa"/>
+              <w:bottom w:w="60" w:type="dxa"/>
+              <w:right w:w="80" w:type="dxa"/>
+            </w:tcMar>
+          </w:tcPr>
+          <w:p>
+            <w:pPr>
+              <w:jc w:val="center"/>
+            </w:pPr>
           </w:p>
         </w:tc>
       </w:tr>
     </w:tbl>
-    <w:p>
-      <w:pPr>
-        <w:pStyle w:val="Titre2"/>
-        <w:keepNext/>
-        <w:pBdr>
-          <w:bottom w:val="single" w:sz="6" w:space="2" w:color="E8571E"/>
-        </w:pBdr>
-        <w:spacing w:before="280" w:after="120"/>
-      </w:pPr>
-      <w:r>
-        <w:rPr>
-          <w:b/>
-          <w:bCs/>
-          <w:color w:val="E8571E"/>
-        </w:rPr>
-        <w:t>Réponses</w:t>
-      </w:r>
-    </w:p>
-    <w:p>
-      <w:pPr>
-        <w:spacing w:after="40"/>
-        <w:jc w:val="both"/>
-      </w:pPr>
-      <w:r>
-        <w:rPr>
-          <w:b/>
-          <w:bCs/>
-          <w:color w:val="E8571E"/>
-        </w:rPr>
-        <w:t xml:space="preserve">1. Flux de trésorerie nets (k€)</w:t>
-      </w:r>
-    </w:p>
-    <w:p>
-      <w:pPr>
-        <w:spacing w:after="40"/>
-        <w:jc w:val="both"/>
-      </w:pPr>
-      <w:r>
-        <w:rPr/>
-        <w:t xml:space="preserve">N : −60 − 3 400 + 100 − 225 = </w:t>
-      </w:r>
-      <w:r>
-        <w:rPr>
-          <w:b/>
-          <w:bCs/>
-        </w:rPr>
-        <w:t xml:space="preserve">−3 585</w:t>
-      </w:r>
-    </w:p>
-    <w:p>
-      <w:pPr>
-        <w:spacing w:after="40"/>
-        <w:jc w:val="both"/>
-      </w:pPr>
-      <w:r>
-        <w:rPr/>
-        <w:t xml:space="preserve">N+1 : 665 − 100 = </w:t>
-      </w:r>
-      <w:r>
-        <w:rPr>
-          <w:b/>
-          <w:bCs/>
-        </w:rPr>
-        <w:t xml:space="preserve">565</w:t>
-      </w:r>
-      <w:r>
-        <w:rPr/>
-        <w:t xml:space="preserve">   N+2 : 965 − 600 − 100 = </w:t>
-      </w:r>
-      <w:r>
-        <w:rPr>
-          <w:b/>
-          <w:bCs/>
-        </w:rPr>
-        <w:t xml:space="preserve">265</w:t>
-      </w:r>
-      <w:r>
-        <w:rPr/>
-        <w:t xml:space="preserve">   N+3 : 1 405 − 30 = </w:t>
-      </w:r>
-      <w:r>
-        <w:rPr>
-          <w:b/>
-          <w:bCs/>
-        </w:rPr>
-        <w:t xml:space="preserve">1 375</w:t>
-      </w:r>
-    </w:p>
-    <w:p>
-      <w:pPr>
-        <w:spacing w:after="40"/>
-        <w:jc w:val="both"/>
-      </w:pPr>
-      <w:r>
-        <w:rPr/>
-        <w:t xml:space="preserve">N+4 : 1 504 + 80 = </w:t>
-      </w:r>
-      <w:r>
-        <w:rPr>
-          <w:b/>
-          <w:bCs/>
-        </w:rPr>
-        <w:t xml:space="preserve">1 584</w:t>
-      </w:r>
-      <w:r>
-        <w:rPr/>
-        <w:t xml:space="preserve">   N+5 : 1 240 + 375 + 225 + 525 = </w:t>
-      </w:r>
-      <w:r>
-        <w:rPr>
-          <w:b/>
-          <w:bCs/>
-        </w:rPr>
-        <w:t xml:space="preserve">2 365</w:t>
-      </w:r>
-    </w:p>
-    <w:p>
-      <w:pPr>
-        <w:spacing w:after="40"/>
-        <w:jc w:val="both"/>
-      </w:pPr>
-      <w:r>
-        <w:rPr>
-          <w:b/>
-          <w:bCs/>
-          <w:color w:val="E8571E"/>
-        </w:rPr>
-        <w:t xml:space="preserve">2. VAN</w:t>
-      </w:r>
-    </w:p>
-    <w:p>
-      <w:pPr>
-        <w:spacing w:after="40"/>
-        <w:jc w:val="both"/>
-      </w:pPr>
-      <w:r>
-        <w:rPr/>
-        <w:t xml:space="preserve">VAN = −3 585 + 565/1,12 + 265/1,12² + 1 375/1,12³ + 1 584/1,12⁴ + 2 365/1,12⁵ = −3 585 + 4 043,0 = </w:t>
-      </w:r>
-      <w:r>
-        <w:rPr>
-          <w:b/>
-          <w:bCs/>
-        </w:rPr>
-        <w:t xml:space="preserve">458,0 k€</w:t>
-      </w:r>
-    </w:p>
-    <w:p>
-      <w:pPr>
-        <w:spacing w:after="40"/>
-        <w:jc w:val="both"/>
-      </w:pPr>
-      <w:r>
-        <w:rPr>
-          <w:b/>
-          <w:bCs/>
-          <w:color w:val="E8571E"/>
-        </w:rPr>
-        <w:t xml:space="preserve">3. TRI</w:t>
-      </w:r>
-    </w:p>
-    <w:p>
-      <w:pPr>
-        <w:spacing w:after="40"/>
-        <w:jc w:val="both"/>
-      </w:pPr>
-      <w:r>
-        <w:rPr/>
-        <w:t xml:space="preserve">VAN(15 %) = 92,2 ; VAN(16 %) = −19,3 → TRI = 15 % + 1 % × 92,2/111,5 = </w:t>
-      </w:r>
-      <w:r>
-        <w:rPr>
-          <w:b/>
-          <w:bCs/>
-        </w:rPr>
-        <w:t xml:space="preserve">15,8 %</w:t>
-      </w:r>
-    </w:p>
-    <w:p>
-      <w:pPr>
-        <w:spacing w:after="40"/>
-        <w:jc w:val="both"/>
-      </w:pPr>
-      <w:r>
-        <w:rPr>
-          <w:b/>
-          <w:bCs/>
-          <w:color w:val="E8571E"/>
-        </w:rPr>
-        <w:t xml:space="preserve">4. IP</w:t>
-      </w:r>
-    </w:p>
-    <w:p>
-      <w:pPr>
-        <w:spacing w:after="40"/>
-        <w:jc w:val="both"/>
-      </w:pPr>
-      <w:r>
-        <w:rPr/>
-        <w:t xml:space="preserve">IP = 1 + 458,0/3 585 = </w:t>
-      </w:r>
-      <w:r>
-        <w:rPr>
-          <w:b/>
-          <w:bCs/>
-        </w:rPr>
-        <w:t xml:space="preserve">1,128</w:t>
-      </w:r>
-    </w:p>
-    <w:p>
-      <w:pPr>
-        <w:spacing w:after="40"/>
-        <w:jc w:val="both"/>
-      </w:pPr>
-      <w:r>
-        <w:rPr>
-          <w:b/>
-          <w:bCs/>
-          <w:color w:val="E8571E"/>
-        </w:rPr>
-        <w:t xml:space="preserve">5. DRCI</w:t>
-      </w:r>
-    </w:p>
-    <w:p>
-      <w:pPr>
-        <w:spacing w:after="40"/>
-        <w:jc w:val="both"/>
-      </w:pPr>
-      <w:r>
-        <w:rPr/>
-        <w:t xml:space="preserve">DRCI = 4 + 883,9/1 342,0 = 4,66 ans = </w:t>
-      </w:r>
-      <w:r>
-        <w:rPr>
-          <w:b/>
-          <w:bCs/>
-        </w:rPr>
-        <w:t xml:space="preserve">4 ans 8 mois</w:t>
-      </w:r>
-    </w:p>
-    <w:p>
-      <w:pPr>
-        <w:spacing w:after="40"/>
-        <w:jc w:val="both"/>
-      </w:pPr>
-      <w:r>
-        <w:rPr>
-          <w:b/>
-          <w:bCs/>
-          <w:color w:val="E8571E"/>
-        </w:rPr>
-        <w:t xml:space="preserve">6. DRCI sans cessions ni récupération du BFR</w:t>
-      </w:r>
-    </w:p>
-    <w:p>
-      <w:pPr>
-        <w:spacing w:after="40"/>
-        <w:jc w:val="both"/>
-      </w:pPr>
-      <w:r>
-        <w:rPr/>
-        <w:t xml:space="preserve">FCF N+5 = 1 240 → actualisé : 1 240 × 0,5674 = 703,6</w:t>
-      </w:r>
-    </w:p>
-    <w:p>
-      <w:pPr>
-        <w:spacing w:after="40"/>
-        <w:jc w:val="both"/>
-      </w:pPr>
-      <w:r>
-        <w:rPr/>
-        <w:t xml:space="preserve">Cumul fin N+5 = −883,9 + 703,6 = </w:t>
-      </w:r>
-      <w:r>
-        <w:rPr>
-          <w:b/>
-          <w:bCs/>
-        </w:rPr>
-        <w:t xml:space="preserve">−180,3 k€</w:t>
-      </w:r>
-      <w:r>
-        <w:rPr/>
-        <w:t xml:space="preserve"> → </w:t>
-      </w:r>
-      <w:r>
-        <w:rPr>
-          <w:b/>
-          <w:bCs/>
-        </w:rPr>
-        <w:t xml:space="preserve">DRCI &gt; 5 ans</w:t>
-      </w:r>
-      <w:r>
-        <w:rPr/>
-        <w:t xml:space="preserve"> (capital non récupéré).</w:t>
-      </w:r>
-    </w:p>
-    <w:p>
-      <w:pPr>
-        <w:spacing w:after="40"/>
-        <w:jc w:val="both"/>
-      </w:pPr>
-      <w:r>
-        <w:rPr>
-          <w:b/>
-          <w:bCs/>
-        </w:rPr>
-        <w:t xml:space="preserve">Conclusion : </w:t>
-      </w:r>
-      <w:r>
-        <w:rPr/>
-        <w:t xml:space="preserve">la rentabilité du projet dépend des flux de fin de projet (valeurs de cession + BFR).</w:t>
-      </w:r>
-    </w:p>
-    <w:p>
-      <w:pPr>
-        <w:spacing w:after="40"/>
-        <w:jc w:val="both"/>
-      </w:pPr>
-      <w:r>
-        <w:rPr>
-          <w:b/>
-          <w:bCs/>
-          <w:color w:val="E8571E"/>
-        </w:rPr>
-        <w:t xml:space="preserve">7. VAN sans cannibalisation</w:t>
-      </w:r>
-    </w:p>
-    <w:p>
-      <w:pPr>
-        <w:spacing w:after="40"/>
-        <w:jc w:val="both"/>
-      </w:pPr>
-      <w:r>
-        <w:rPr/>
-        <w:t xml:space="preserve">Effet après impôt : 50 × 0,75 = 37,5/an → 37,5 × 3,6048 = 135,2</w:t>
-      </w:r>
-    </w:p>
-    <w:p>
-      <w:pPr>
-        <w:spacing w:after="40"/>
-        <w:jc w:val="both"/>
-      </w:pPr>
-      <w:r>
-        <w:rPr/>
-        <w:t xml:space="preserve">VAN = 458,0 + 135,2 = </w:t>
-      </w:r>
-      <w:r>
-        <w:rPr>
-          <w:b/>
-          <w:bCs/>
-        </w:rPr>
-        <w:t xml:space="preserve">593,2 k€</w:t>
-      </w:r>
-      <w:r>
-        <w:rPr/>
-        <w:t xml:space="preserve"> (+30 %)</w:t>
-      </w:r>
-    </w:p>
-    <w:p>
-      <w:pPr>
-        <w:spacing w:after="40"/>
-        <w:jc w:val="both"/>
-      </w:pPr>
-      <w:r>
-        <w:rPr>
-          <w:b/>
-          <w:bCs/>
-        </w:rPr>
-        <w:t xml:space="preserve">Commentaire : </w:t>
-      </w:r>
-      <w:r>
-        <w:rPr/>
-        <w:t xml:space="preserve">VAN surestimée ; la cannibalisation est un flux différentiel à intégrer.</w:t>
-      </w:r>
-    </w:p>
     <w:p>
       <w:pPr>
         <w:pStyle w:val="Titre2"/>

</xml_diff>

<commit_message>
Cas DURANCEL : annexe 5 (DRCI) complétée
Co-Authored-By: Claude Opus 5.5 <noreply@anthropic.com>
Claude-Session: https://claude.ai/code/session_01QEYQGJWiqJDfMnwpNecvDB
</commit_message>
<xml_diff>
--- a/MBA2_Volet_financier_du_BP_S5_Cas_DURANCEL_Enonce.docx
+++ b/MBA2_Volet_financier_du_BP_S5_Cas_DURANCEL_Enonce.docx
@@ -8159,30 +8159,44 @@
           </w:tcPr>
           <w:p>
             <w:pPr>
-              <w:jc w:val="center"/>
-            </w:pPr>
-          </w:p>
-        </w:tc>
-        <w:tc>
-          <w:tcPr>
-            <w:tcW w:w="1233" w:type="dxa"/>
-            <w:tcBorders>
-              <w:top w:val="single" w:sz="4" w:space="0" w:color="E8571E"/>
-              <w:left w:val="single" w:sz="4" w:space="0" w:color="E8571E"/>
-              <w:bottom w:val="single" w:sz="4" w:space="0" w:color="E8571E"/>
-              <w:right w:val="single" w:sz="4" w:space="0" w:color="E8571E"/>
-            </w:tcBorders>
-            <w:tcMar>
-              <w:top w:w="60" w:type="dxa"/>
-              <w:left w:w="80" w:type="dxa"/>
-              <w:bottom w:w="60" w:type="dxa"/>
-              <w:right w:w="80" w:type="dxa"/>
-            </w:tcMar>
-          </w:tcPr>
-          <w:p>
-            <w:pPr>
-              <w:jc w:val="center"/>
-            </w:pPr>
+              <w:jc w:val="right"/>
+            </w:pPr>
+            <w:r>
+              <w:rPr>
+                <w:sz w:val="20"/>
+                <w:szCs w:val="20"/>
+              </w:rPr>
+              <w:t xml:space="preserve">1 006,7</w:t>
+            </w:r>
+          </w:p>
+        </w:tc>
+        <w:tc>
+          <w:tcPr>
+            <w:tcW w:w="1233" w:type="dxa"/>
+            <w:tcBorders>
+              <w:top w:val="single" w:sz="4" w:space="0" w:color="E8571E"/>
+              <w:left w:val="single" w:sz="4" w:space="0" w:color="E8571E"/>
+              <w:bottom w:val="single" w:sz="4" w:space="0" w:color="E8571E"/>
+              <w:right w:val="single" w:sz="4" w:space="0" w:color="E8571E"/>
+            </w:tcBorders>
+            <w:tcMar>
+              <w:top w:w="60" w:type="dxa"/>
+              <w:left w:w="80" w:type="dxa"/>
+              <w:bottom w:w="60" w:type="dxa"/>
+              <w:right w:w="80" w:type="dxa"/>
+            </w:tcMar>
+          </w:tcPr>
+          <w:p>
+            <w:pPr>
+              <w:jc w:val="right"/>
+            </w:pPr>
+            <w:r>
+              <w:rPr>
+                <w:sz w:val="20"/>
+                <w:szCs w:val="20"/>
+              </w:rPr>
+              <w:t xml:space="preserve">1 342,0</w:t>
+            </w:r>
           </w:p>
         </w:tc>
       </w:tr>
@@ -8337,54 +8351,81 @@
           </w:tcPr>
           <w:p>
             <w:pPr>
-              <w:jc w:val="center"/>
-            </w:pPr>
-          </w:p>
-        </w:tc>
-        <w:tc>
-          <w:tcPr>
-            <w:tcW w:w="1233" w:type="dxa"/>
-            <w:tcBorders>
-              <w:top w:val="single" w:sz="4" w:space="0" w:color="E8571E"/>
-              <w:left w:val="single" w:sz="4" w:space="0" w:color="E8571E"/>
-              <w:bottom w:val="single" w:sz="4" w:space="0" w:color="E8571E"/>
-              <w:right w:val="single" w:sz="4" w:space="0" w:color="E8571E"/>
-            </w:tcBorders>
-            <w:shd w:val="clear" w:color="auto" w:fill="F9DDD5"/>
-            <w:tcMar>
-              <w:top w:w="60" w:type="dxa"/>
-              <w:left w:w="80" w:type="dxa"/>
-              <w:bottom w:w="60" w:type="dxa"/>
-              <w:right w:w="80" w:type="dxa"/>
-            </w:tcMar>
-          </w:tcPr>
-          <w:p>
-            <w:pPr>
-              <w:jc w:val="center"/>
-            </w:pPr>
-          </w:p>
-        </w:tc>
-        <w:tc>
-          <w:tcPr>
-            <w:tcW w:w="1233" w:type="dxa"/>
-            <w:tcBorders>
-              <w:top w:val="single" w:sz="4" w:space="0" w:color="E8571E"/>
-              <w:left w:val="single" w:sz="4" w:space="0" w:color="E8571E"/>
-              <w:bottom w:val="single" w:sz="4" w:space="0" w:color="E8571E"/>
-              <w:right w:val="single" w:sz="4" w:space="0" w:color="E8571E"/>
-            </w:tcBorders>
-            <w:shd w:val="clear" w:color="auto" w:fill="F9DDD5"/>
-            <w:tcMar>
-              <w:top w:w="60" w:type="dxa"/>
-              <w:left w:w="80" w:type="dxa"/>
-              <w:bottom w:w="60" w:type="dxa"/>
-              <w:right w:w="80" w:type="dxa"/>
-            </w:tcMar>
-          </w:tcPr>
-          <w:p>
-            <w:pPr>
-              <w:jc w:val="center"/>
-            </w:pPr>
+              <w:jc w:val="right"/>
+            </w:pPr>
+            <w:r>
+              <w:rPr>
+                <w:b/>
+                <w:bCs/>
+                <w:sz w:val="20"/>
+                <w:szCs w:val="20"/>
+              </w:rPr>
+              <w:t xml:space="preserve">−1 890,6</w:t>
+            </w:r>
+          </w:p>
+        </w:tc>
+        <w:tc>
+          <w:tcPr>
+            <w:tcW w:w="1233" w:type="dxa"/>
+            <w:tcBorders>
+              <w:top w:val="single" w:sz="4" w:space="0" w:color="E8571E"/>
+              <w:left w:val="single" w:sz="4" w:space="0" w:color="E8571E"/>
+              <w:bottom w:val="single" w:sz="4" w:space="0" w:color="E8571E"/>
+              <w:right w:val="single" w:sz="4" w:space="0" w:color="E8571E"/>
+            </w:tcBorders>
+            <w:shd w:val="clear" w:color="auto" w:fill="F9DDD5"/>
+            <w:tcMar>
+              <w:top w:w="60" w:type="dxa"/>
+              <w:left w:w="80" w:type="dxa"/>
+              <w:bottom w:w="60" w:type="dxa"/>
+              <w:right w:w="80" w:type="dxa"/>
+            </w:tcMar>
+          </w:tcPr>
+          <w:p>
+            <w:pPr>
+              <w:jc w:val="right"/>
+            </w:pPr>
+            <w:r>
+              <w:rPr>
+                <w:b/>
+                <w:bCs/>
+                <w:sz w:val="20"/>
+                <w:szCs w:val="20"/>
+              </w:rPr>
+              <w:t xml:space="preserve">−883,9</w:t>
+            </w:r>
+          </w:p>
+        </w:tc>
+        <w:tc>
+          <w:tcPr>
+            <w:tcW w:w="1233" w:type="dxa"/>
+            <w:tcBorders>
+              <w:top w:val="single" w:sz="4" w:space="0" w:color="E8571E"/>
+              <w:left w:val="single" w:sz="4" w:space="0" w:color="E8571E"/>
+              <w:bottom w:val="single" w:sz="4" w:space="0" w:color="E8571E"/>
+              <w:right w:val="single" w:sz="4" w:space="0" w:color="E8571E"/>
+            </w:tcBorders>
+            <w:shd w:val="clear" w:color="auto" w:fill="F9DDD5"/>
+            <w:tcMar>
+              <w:top w:w="60" w:type="dxa"/>
+              <w:left w:w="80" w:type="dxa"/>
+              <w:bottom w:w="60" w:type="dxa"/>
+              <w:right w:w="80" w:type="dxa"/>
+            </w:tcMar>
+          </w:tcPr>
+          <w:p>
+            <w:pPr>
+              <w:jc w:val="right"/>
+            </w:pPr>
+            <w:r>
+              <w:rPr>
+                <w:b/>
+                <w:bCs/>
+                <w:sz w:val="20"/>
+                <w:szCs w:val="20"/>
+              </w:rPr>
+              <w:t xml:space="preserve">458,0</w:t>
+            </w:r>
           </w:p>
         </w:tc>
       </w:tr>

</xml_diff>

<commit_message>
Cas DURANCEL : ajout des noms du groupe
Co-Authored-By: Claude Opus 5.5 <noreply@anthropic.com>
Claude-Session: https://claude.ai/code/session_01QEYQGJWiqJDfMnwpNecvDB
</commit_message>
<xml_diff>
--- a/MBA2_Volet_financier_du_BP_S5_Cas_DURANCEL_Enonce.docx
+++ b/MBA2_Volet_financier_du_BP_S5_Cas_DURANCEL_Enonce.docx
@@ -31,6 +31,21 @@
           <w:color w:val="808080"/>
         </w:rPr>
         <w:t>Choix d’investissement : flux de trésorerie, VAN, TRI, IP, DRCI</w:t>
+      </w:r>
+    </w:p>
+    <w:p>
+      <w:pPr>
+        <w:spacing w:after="200"/>
+      </w:pPr>
+      <w:r>
+        <w:rPr>
+          <w:b/>
+          <w:bCs/>
+        </w:rPr>
+        <w:t xml:space="preserve">Groupe : </w:t>
+      </w:r>
+      <w:r>
+        <w:t>Marie ABBA SOW – Urdy Anaïca MOUKOUTOU NJOYO – Acacia Sylvestre OMIÉRÉ – Amadou NIANG</w:t>
       </w:r>
     </w:p>
     <w:p>

</xml_diff>